<commit_message>
docs: rut gon tieu de tai lieu thanh He thong config va tinh diem tu dong cho Google Sheet tren ca MD va DOCX
</commit_message>
<xml_diff>
--- a/HUONG_DAN_SU_DUNG.docx
+++ b/HUONG_DAN_SU_DUNG.docx
@@ -14,22 +14,7 @@
           <w:color w:val="1E3A8A"/>
           <w:sz w:val="40"/>
         </w:rPr>
-        <w:t>HƯỚNG DẪN SỬ DỤNG &amp; ĐÀO TẠO VẬN HÀNH HỆ THỐNG CẤU HÌNH TÍNH ĐIỂM CVKD</w:t>
-      </w:r>
-    </w:p>
-    <w:p>
-      <w:pPr>
-        <w:spacing w:before="40" w:after="80" w:line="276" w:lineRule="auto"/>
-      </w:pPr>
-      <w:r>
-        <w:rPr>
-          <w:rFonts w:ascii="Segoe UI" w:hAnsi="Segoe UI"/>
-          <w:b w:val="0"/>
-          <w:i w:val="0"/>
-          <w:color w:val="1E293B"/>
-          <w:sz w:val="21"/>
-        </w:rPr>
-        <w:t>Tài liệu này cung cấp toàn bộ kiến trúc, sơ đồ luồng hoạt động (flowcharts), quy tắc tính điểm và hướng dẫn chi tiết từng bước dành cho Quản lý, Chuyên viên Vận hành, Kế toán và Chuyên viên Kinh doanh (CVKD).</w:t>
+        <w:t>HỆ THỐNG CONFIG VÀ TÍNH ĐIỂM TỰ ĐỘNG CHO GOOGLE SHEET</w:t>
       </w:r>
     </w:p>
     <w:p>

</xml_diff>

<commit_message>
fix(docs): sua loi hien thi raw markdown link trong Muc Luc cua tep Word HUONG_DAN_SU_DUNG.docx
</commit_message>
<xml_diff>
--- a/HUONG_DAN_SU_DUNG.docx
+++ b/HUONG_DAN_SU_DUNG.docx
@@ -42,427 +42,427 @@
     </w:p>
     <w:p>
       <w:pPr>
-        <w:spacing w:before="30" w:after="30"/>
-        <w:ind w:left="360"/>
+        <w:spacing w:before="60" w:after="40"/>
+        <w:ind w:left="288"/>
       </w:pPr>
       <w:r>
         <w:rPr>
           <w:rFonts w:ascii="Segoe UI" w:hAnsi="Segoe UI"/>
           <w:b/>
-          <w:color w:val="1E3A8A"/>
-          <w:sz w:val="20"/>
+          <w:color w:val="1D4ED8"/>
+          <w:sz w:val="22"/>
         </w:rPr>
         <w:t xml:space="preserve">1. </w:t>
       </w:r>
       <w:r>
         <w:rPr>
           <w:rFonts w:ascii="Segoe UI" w:hAnsi="Segoe UI"/>
-          <w:b w:val="0"/>
+          <w:b/>
           <w:i w:val="0"/>
           <w:color w:val="1E293B"/>
-          <w:sz w:val="20"/>
-        </w:rPr>
-        <w:t>[Tổng Quan Hệ Thống](#1-tổng-quan-hệ-thống)</w:t>
+          <w:sz w:val="22"/>
+        </w:rPr>
+        <w:t>Tổng Quan Hệ Thống</w:t>
       </w:r>
     </w:p>
     <w:p>
       <w:pPr>
-        <w:spacing w:before="30" w:after="30"/>
-        <w:ind w:left="360"/>
+        <w:spacing w:before="60" w:after="40"/>
+        <w:ind w:left="288"/>
       </w:pPr>
       <w:r>
         <w:rPr>
           <w:rFonts w:ascii="Segoe UI" w:hAnsi="Segoe UI"/>
           <w:b/>
-          <w:color w:val="1E3A8A"/>
-          <w:sz w:val="20"/>
+          <w:color w:val="1D4ED8"/>
+          <w:sz w:val="22"/>
         </w:rPr>
         <w:t xml:space="preserve">2. </w:t>
       </w:r>
       <w:r>
         <w:rPr>
           <w:rFonts w:ascii="Segoe UI" w:hAnsi="Segoe UI"/>
-          <w:b w:val="0"/>
+          <w:b/>
           <w:i w:val="0"/>
           <w:color w:val="1E293B"/>
-          <w:sz w:val="20"/>
-        </w:rPr>
-        <w:t>[Cấu Trúc Dữ Liệu &amp; 3 Bảng Cấu Hình](#2-cấu-trúc-dữ-liệu--3-bảng-cấu-hình)</w:t>
+          <w:sz w:val="22"/>
+        </w:rPr>
+        <w:t>Cấu Trúc Dữ Liệu &amp; 3 Bảng Cấu Hình</w:t>
       </w:r>
     </w:p>
     <w:p>
       <w:pPr>
-        <w:spacing w:before="30" w:after="30"/>
-        <w:ind w:left="360"/>
+        <w:spacing w:before="60" w:after="40"/>
+        <w:ind w:left="288"/>
       </w:pPr>
       <w:r>
         <w:rPr>
           <w:rFonts w:ascii="Segoe UI" w:hAnsi="Segoe UI"/>
           <w:b/>
-          <w:color w:val="1E3A8A"/>
-          <w:sz w:val="20"/>
+          <w:color w:val="1D4ED8"/>
+          <w:sz w:val="22"/>
         </w:rPr>
         <w:t xml:space="preserve">3. </w:t>
       </w:r>
       <w:r>
         <w:rPr>
           <w:rFonts w:ascii="Segoe UI" w:hAnsi="Segoe UI"/>
-          <w:b w:val="0"/>
+          <w:b/>
           <w:i w:val="0"/>
           <w:color w:val="1E293B"/>
-          <w:sz w:val="20"/>
-        </w:rPr>
-        <w:t>[Sơ Đồ Luồng Hoạt Động (Flowcharts)](#3-sơ-đồ-luồng-hoạt-động-flowcharts)</w:t>
+          <w:sz w:val="22"/>
+        </w:rPr>
+        <w:t>Sơ Đồ Luồng Hoạt Động (Flowcharts)</w:t>
       </w:r>
     </w:p>
     <w:p>
       <w:pPr>
-        <w:spacing w:before="30" w:after="30"/>
-        <w:ind w:left="720"/>
+        <w:spacing w:before="20" w:after="20"/>
+        <w:ind w:left="648"/>
       </w:pPr>
       <w:r>
         <w:rPr>
           <w:rFonts w:ascii="Arial" w:hAnsi="Arial"/>
           <w:b/>
-          <w:color w:val="2563EB"/>
-          <w:sz w:val="20"/>
-        </w:rPr>
-        <w:t xml:space="preserve">○  </w:t>
+          <w:color w:val="0EA5E9"/>
+          <w:sz w:val="19"/>
+        </w:rPr>
+        <w:t xml:space="preserve">•  </w:t>
       </w:r>
       <w:r>
         <w:rPr>
           <w:rFonts w:ascii="Segoe UI" w:hAnsi="Segoe UI"/>
           <w:b w:val="0"/>
           <w:i w:val="0"/>
-          <w:color w:val="1E293B"/>
-          <w:sz w:val="20"/>
-        </w:rPr>
-        <w:t>[3.1. Luồng Tạo &amp; Cập Nhật Điểm Quỹ NW (Bảng Tổng Hợp)](#31-luồng-tạo--cập-nhật-điểm-quỹ-nw-bảng-tổng-hợp)</w:t>
+          <w:color w:val="334155"/>
+          <w:sz w:val="20"/>
+        </w:rPr>
+        <w:t>3.1. Luồng Tạo &amp; Cập Nhật Điểm Quỹ NW (Bảng Tổng Hợp)</w:t>
       </w:r>
     </w:p>
     <w:p>
       <w:pPr>
-        <w:spacing w:before="30" w:after="30"/>
-        <w:ind w:left="720"/>
+        <w:spacing w:before="20" w:after="20"/>
+        <w:ind w:left="648"/>
       </w:pPr>
       <w:r>
         <w:rPr>
           <w:rFonts w:ascii="Arial" w:hAnsi="Arial"/>
           <w:b/>
-          <w:color w:val="2563EB"/>
-          <w:sz w:val="20"/>
-        </w:rPr>
-        <w:t xml:space="preserve">○  </w:t>
+          <w:color w:val="0EA5E9"/>
+          <w:sz w:val="19"/>
+        </w:rPr>
+        <w:t xml:space="preserve">•  </w:t>
       </w:r>
       <w:r>
         <w:rPr>
           <w:rFonts w:ascii="Segoe UI" w:hAnsi="Segoe UI"/>
           <w:b w:val="0"/>
           <w:i w:val="0"/>
-          <w:color w:val="1E293B"/>
-          <w:sz w:val="20"/>
-        </w:rPr>
-        <w:t>[3.2. Luồng Tạo &amp; Cập Nhật Điểm Quỹ Chéo (Bảng Dự Án F2)](#32-luồng-tạo--cập-nhật-điểm-quỹ-chéo-bảng-dự-án-f2)</w:t>
+          <w:color w:val="334155"/>
+          <w:sz w:val="20"/>
+        </w:rPr>
+        <w:t>3.2. Luồng Tạo &amp; Cập Nhật Điểm Quỹ Chéo (Bảng Dự Án F2)</w:t>
       </w:r>
     </w:p>
     <w:p>
       <w:pPr>
-        <w:spacing w:before="30" w:after="30"/>
-        <w:ind w:left="720"/>
+        <w:spacing w:before="20" w:after="20"/>
+        <w:ind w:left="648"/>
       </w:pPr>
       <w:r>
         <w:rPr>
           <w:rFonts w:ascii="Arial" w:hAnsi="Arial"/>
           <w:b/>
-          <w:color w:val="2563EB"/>
-          <w:sz w:val="20"/>
-        </w:rPr>
-        <w:t xml:space="preserve">○  </w:t>
+          <w:color w:val="0EA5E9"/>
+          <w:sz w:val="19"/>
+        </w:rPr>
+        <w:t xml:space="preserve">•  </w:t>
       </w:r>
       <w:r>
         <w:rPr>
           <w:rFonts w:ascii="Segoe UI" w:hAnsi="Segoe UI"/>
           <w:b w:val="0"/>
           <w:i w:val="0"/>
-          <w:color w:val="1E293B"/>
-          <w:sz w:val="20"/>
-        </w:rPr>
-        <w:t>[3.3. Luồng Tạo Điểm Thi Đua Theo Chiến Dịch (Multi-Campaign)](#33-luồng-tạo-điểm-thi-đua-theo-chiến-dịch-multi-campaign)</w:t>
+          <w:color w:val="334155"/>
+          <w:sz w:val="20"/>
+        </w:rPr>
+        <w:t>3.3. Luồng Tạo Điểm Thi Đua Theo Chiến Dịch (Multi-Campaign)</w:t>
       </w:r>
     </w:p>
     <w:p>
       <w:pPr>
-        <w:spacing w:before="30" w:after="30"/>
-        <w:ind w:left="720"/>
+        <w:spacing w:before="20" w:after="20"/>
+        <w:ind w:left="648"/>
       </w:pPr>
       <w:r>
         <w:rPr>
           <w:rFonts w:ascii="Arial" w:hAnsi="Arial"/>
           <w:b/>
-          <w:color w:val="2563EB"/>
-          <w:sz w:val="20"/>
-        </w:rPr>
-        <w:t xml:space="preserve">○  </w:t>
+          <w:color w:val="0EA5E9"/>
+          <w:sz w:val="19"/>
+        </w:rPr>
+        <w:t xml:space="preserve">•  </w:t>
       </w:r>
       <w:r>
         <w:rPr>
           <w:rFonts w:ascii="Segoe UI" w:hAnsi="Segoe UI"/>
           <w:b w:val="0"/>
           <w:i w:val="0"/>
-          <w:color w:val="1E293B"/>
-          <w:sz w:val="20"/>
-        </w:rPr>
-        <w:t>[3.4. Luồng Tính Điểm Tự Động Cho Giao Dịch (Calculation Engine Flow)](#34-luồng-tính-điểm-tự-động-cho-giao-dịch)</w:t>
+          <w:color w:val="334155"/>
+          <w:sz w:val="20"/>
+        </w:rPr>
+        <w:t>3.4. Luồng Tính Điểm Tự Động Cho Giao Dịch (Calculation Engine Flow)</w:t>
       </w:r>
     </w:p>
     <w:p>
       <w:pPr>
-        <w:spacing w:before="30" w:after="30"/>
-        <w:ind w:left="720"/>
+        <w:spacing w:before="20" w:after="20"/>
+        <w:ind w:left="648"/>
       </w:pPr>
       <w:r>
         <w:rPr>
           <w:rFonts w:ascii="Arial" w:hAnsi="Arial"/>
           <w:b/>
-          <w:color w:val="2563EB"/>
-          <w:sz w:val="20"/>
-        </w:rPr>
-        <w:t xml:space="preserve">○  </w:t>
+          <w:color w:val="0EA5E9"/>
+          <w:sz w:val="19"/>
+        </w:rPr>
+        <w:t xml:space="preserve">•  </w:t>
       </w:r>
       <w:r>
         <w:rPr>
           <w:rFonts w:ascii="Segoe UI" w:hAnsi="Segoe UI"/>
           <w:b w:val="0"/>
           <w:i w:val="0"/>
-          <w:color w:val="1E293B"/>
-          <w:sz w:val="20"/>
-        </w:rPr>
-        <w:t>[3.5. Luồng Tự Động Chuyển Tháng &amp; Sao Chép Điểm (Auto Sync Month)](#35-luồng-tự-động-chuyển-tháng--sao-chép-điểm)</w:t>
+          <w:color w:val="334155"/>
+          <w:sz w:val="20"/>
+        </w:rPr>
+        <w:t>3.5. Luồng Tự Động Chuyển Tháng &amp; Sao Chép Điểm (Auto Sync Month)</w:t>
       </w:r>
     </w:p>
     <w:p>
       <w:pPr>
-        <w:spacing w:before="30" w:after="30"/>
-        <w:ind w:left="360"/>
+        <w:spacing w:before="60" w:after="40"/>
+        <w:ind w:left="288"/>
       </w:pPr>
       <w:r>
         <w:rPr>
           <w:rFonts w:ascii="Segoe UI" w:hAnsi="Segoe UI"/>
           <w:b/>
-          <w:color w:val="1E3A8A"/>
-          <w:sz w:val="20"/>
+          <w:color w:val="1D4ED8"/>
+          <w:sz w:val="22"/>
         </w:rPr>
         <w:t xml:space="preserve">4. </w:t>
       </w:r>
       <w:r>
         <w:rPr>
           <w:rFonts w:ascii="Segoe UI" w:hAnsi="Segoe UI"/>
-          <w:b w:val="0"/>
+          <w:b/>
           <w:i w:val="0"/>
           <w:color w:val="1E293B"/>
-          <w:sz w:val="20"/>
-        </w:rPr>
-        <w:t>[Hướng Dẫn Thao Tác Chi Tiết (Step-by-Step Training)](#4-hướng-dẫn-thao-tác-chi-tiết)</w:t>
+          <w:sz w:val="22"/>
+        </w:rPr>
+        <w:t>Hướng Dẫn Thao Tác Chi Tiết (Step-by-Step Training)</w:t>
       </w:r>
     </w:p>
     <w:p>
       <w:pPr>
-        <w:spacing w:before="30" w:after="30"/>
-        <w:ind w:left="720"/>
+        <w:spacing w:before="20" w:after="20"/>
+        <w:ind w:left="648"/>
       </w:pPr>
       <w:r>
         <w:rPr>
           <w:rFonts w:ascii="Arial" w:hAnsi="Arial"/>
           <w:b/>
-          <w:color w:val="2563EB"/>
-          <w:sz w:val="20"/>
-        </w:rPr>
-        <w:t xml:space="preserve">○  </w:t>
+          <w:color w:val="0EA5E9"/>
+          <w:sz w:val="19"/>
+        </w:rPr>
+        <w:t xml:space="preserve">•  </w:t>
       </w:r>
       <w:r>
         <w:rPr>
           <w:rFonts w:ascii="Segoe UI" w:hAnsi="Segoe UI"/>
           <w:b w:val="0"/>
           <w:i w:val="0"/>
-          <w:color w:val="1E293B"/>
-          <w:sz w:val="20"/>
-        </w:rPr>
-        <w:t>[4.1. Mở Bảng Cấu Hình Điểm](#41-mở-bảng-cấu-hình-điểm)</w:t>
+          <w:color w:val="334155"/>
+          <w:sz w:val="20"/>
+        </w:rPr>
+        <w:t>4.1. Mở Bảng Cấu Hình Điểm</w:t>
       </w:r>
     </w:p>
     <w:p>
       <w:pPr>
-        <w:spacing w:before="30" w:after="30"/>
-        <w:ind w:left="720"/>
+        <w:spacing w:before="20" w:after="20"/>
+        <w:ind w:left="648"/>
       </w:pPr>
       <w:r>
         <w:rPr>
           <w:rFonts w:ascii="Arial" w:hAnsi="Arial"/>
           <w:b/>
-          <w:color w:val="2563EB"/>
-          <w:sz w:val="20"/>
-        </w:rPr>
-        <w:t xml:space="preserve">○  </w:t>
+          <w:color w:val="0EA5E9"/>
+          <w:sz w:val="19"/>
+        </w:rPr>
+        <w:t xml:space="preserve">•  </w:t>
       </w:r>
       <w:r>
         <w:rPr>
           <w:rFonts w:ascii="Segoe UI" w:hAnsi="Segoe UI"/>
           <w:b w:val="0"/>
           <w:i w:val="0"/>
-          <w:color w:val="1E293B"/>
-          <w:sz w:val="20"/>
-        </w:rPr>
-        <w:t>[4.2. Quản Lý Điểm Quỹ NW (Bảng Tổng Hợp)](#42-quản-lý-điểm-quỹ-nw-bảng-tổng-hợp)</w:t>
+          <w:color w:val="334155"/>
+          <w:sz w:val="20"/>
+        </w:rPr>
+        <w:t>4.2. Quản Lý Điểm Quỹ NW (Bảng Tổng Hợp)</w:t>
       </w:r>
     </w:p>
     <w:p>
       <w:pPr>
-        <w:spacing w:before="30" w:after="30"/>
-        <w:ind w:left="720"/>
+        <w:spacing w:before="20" w:after="20"/>
+        <w:ind w:left="648"/>
       </w:pPr>
       <w:r>
         <w:rPr>
           <w:rFonts w:ascii="Arial" w:hAnsi="Arial"/>
           <w:b/>
-          <w:color w:val="2563EB"/>
-          <w:sz w:val="20"/>
-        </w:rPr>
-        <w:t xml:space="preserve">○  </w:t>
+          <w:color w:val="0EA5E9"/>
+          <w:sz w:val="19"/>
+        </w:rPr>
+        <w:t xml:space="preserve">•  </w:t>
       </w:r>
       <w:r>
         <w:rPr>
           <w:rFonts w:ascii="Segoe UI" w:hAnsi="Segoe UI"/>
           <w:b w:val="0"/>
           <w:i w:val="0"/>
-          <w:color w:val="1E293B"/>
-          <w:sz w:val="20"/>
-        </w:rPr>
-        <w:t>[4.3. Quản Lý Điểm Quỹ Chéo (Bảng Dự Án F2)](#43-quản-lý-điểm-quỹ-chéo-bảng-dự-án-f2)</w:t>
+          <w:color w:val="334155"/>
+          <w:sz w:val="20"/>
+        </w:rPr>
+        <w:t>4.3. Quản Lý Điểm Quỹ Chéo (Bảng Dự Án F2)</w:t>
       </w:r>
     </w:p>
     <w:p>
       <w:pPr>
-        <w:spacing w:before="30" w:after="30"/>
-        <w:ind w:left="720"/>
+        <w:spacing w:before="20" w:after="20"/>
+        <w:ind w:left="648"/>
       </w:pPr>
       <w:r>
         <w:rPr>
           <w:rFonts w:ascii="Arial" w:hAnsi="Arial"/>
           <w:b/>
-          <w:color w:val="2563EB"/>
-          <w:sz w:val="20"/>
-        </w:rPr>
-        <w:t xml:space="preserve">○  </w:t>
+          <w:color w:val="0EA5E9"/>
+          <w:sz w:val="19"/>
+        </w:rPr>
+        <w:t xml:space="preserve">•  </w:t>
       </w:r>
       <w:r>
         <w:rPr>
           <w:rFonts w:ascii="Segoe UI" w:hAnsi="Segoe UI"/>
           <w:b w:val="0"/>
           <w:i w:val="0"/>
-          <w:color w:val="1E293B"/>
-          <w:sz w:val="20"/>
-        </w:rPr>
-        <w:t>[4.4. Quản Lý Điểm Chiến Dịch Đặc Biệt (Multi-Campaign)](#44-quản-lý-điểm-chiến-dịch-đặc-biệt-multi-campaign)</w:t>
+          <w:color w:val="334155"/>
+          <w:sz w:val="20"/>
+        </w:rPr>
+        <w:t>4.4. Quản Lý Điểm Chiến Dịch Đặc Biệt (Multi-Campaign)</w:t>
       </w:r>
     </w:p>
     <w:p>
       <w:pPr>
-        <w:spacing w:before="30" w:after="30"/>
-        <w:ind w:left="720"/>
+        <w:spacing w:before="20" w:after="20"/>
+        <w:ind w:left="648"/>
       </w:pPr>
       <w:r>
         <w:rPr>
           <w:rFonts w:ascii="Arial" w:hAnsi="Arial"/>
           <w:b/>
-          <w:color w:val="2563EB"/>
-          <w:sz w:val="20"/>
-        </w:rPr>
-        <w:t xml:space="preserve">○  </w:t>
+          <w:color w:val="0EA5E9"/>
+          <w:sz w:val="19"/>
+        </w:rPr>
+        <w:t xml:space="preserve">•  </w:t>
       </w:r>
       <w:r>
         <w:rPr>
           <w:rFonts w:ascii="Segoe UI" w:hAnsi="Segoe UI"/>
           <w:b w:val="0"/>
           <w:i w:val="0"/>
-          <w:color w:val="1E293B"/>
-          <w:sz w:val="20"/>
-        </w:rPr>
-        <w:t>[4.5. Lưu Thay Đổi An Toàn](#45-lưu-thay-đổi-an-toàn)</w:t>
+          <w:color w:val="334155"/>
+          <w:sz w:val="20"/>
+        </w:rPr>
+        <w:t>4.5. Lưu Thay Đổi An Toàn</w:t>
       </w:r>
     </w:p>
     <w:p>
       <w:pPr>
-        <w:spacing w:before="30" w:after="30"/>
-        <w:ind w:left="720"/>
+        <w:spacing w:before="20" w:after="20"/>
+        <w:ind w:left="648"/>
       </w:pPr>
       <w:r>
         <w:rPr>
           <w:rFonts w:ascii="Arial" w:hAnsi="Arial"/>
           <w:b/>
-          <w:color w:val="2563EB"/>
-          <w:sz w:val="20"/>
-        </w:rPr>
-        <w:t xml:space="preserve">○  </w:t>
+          <w:color w:val="0EA5E9"/>
+          <w:sz w:val="19"/>
+        </w:rPr>
+        <w:t xml:space="preserve">•  </w:t>
       </w:r>
       <w:r>
         <w:rPr>
           <w:rFonts w:ascii="Segoe UI" w:hAnsi="Segoe UI"/>
           <w:b w:val="0"/>
           <w:i w:val="0"/>
-          <w:color w:val="1E293B"/>
-          <w:sz w:val="20"/>
-        </w:rPr>
-        <w:t>[4.6. Kết Quả Đồng Bộ Sang Google Sheets Sau Khi Lưu](#46-kết-quả-đồng-bộ-sang-google-sheets-sau-khi-lưu)</w:t>
+          <w:color w:val="334155"/>
+          <w:sz w:val="20"/>
+        </w:rPr>
+        <w:t>4.6. Kết Quả Đồng Bộ Sang Google Sheets Sau Khi Lưu</w:t>
       </w:r>
     </w:p>
     <w:p>
       <w:pPr>
-        <w:spacing w:before="30" w:after="30"/>
-        <w:ind w:left="360"/>
+        <w:spacing w:before="60" w:after="40"/>
+        <w:ind w:left="288"/>
       </w:pPr>
       <w:r>
         <w:rPr>
           <w:rFonts w:ascii="Segoe UI" w:hAnsi="Segoe UI"/>
           <w:b/>
-          <w:color w:val="1E3A8A"/>
-          <w:sz w:val="20"/>
+          <w:color w:val="1D4ED8"/>
+          <w:sz w:val="22"/>
         </w:rPr>
         <w:t xml:space="preserve">5. </w:t>
       </w:r>
       <w:r>
         <w:rPr>
           <w:rFonts w:ascii="Segoe UI" w:hAnsi="Segoe UI"/>
-          <w:b w:val="0"/>
+          <w:b/>
           <w:i w:val="0"/>
           <w:color w:val="1E293B"/>
-          <w:sz w:val="20"/>
-        </w:rPr>
-        <w:t>[Cơ Chế Khớp &amp; Thứ Tự Ưu Tiên Tính Điểm](#5-cơ-chế-khớp--thứ-tự-ưu-tiên-tính-điểm)</w:t>
+          <w:sz w:val="22"/>
+        </w:rPr>
+        <w:t>Cơ Chế Khớp &amp; Thứ Tự Ưu Tiên Tính Điểm</w:t>
       </w:r>
     </w:p>
     <w:p>
       <w:pPr>
-        <w:spacing w:before="30" w:after="30"/>
-        <w:ind w:left="360"/>
+        <w:spacing w:before="60" w:after="40"/>
+        <w:ind w:left="288"/>
       </w:pPr>
       <w:r>
         <w:rPr>
           <w:rFonts w:ascii="Segoe UI" w:hAnsi="Segoe UI"/>
           <w:b/>
-          <w:color w:val="1E3A8A"/>
-          <w:sz w:val="20"/>
+          <w:color w:val="1D4ED8"/>
+          <w:sz w:val="22"/>
         </w:rPr>
         <w:t xml:space="preserve">6. </w:t>
       </w:r>
       <w:r>
         <w:rPr>
           <w:rFonts w:ascii="Segoe UI" w:hAnsi="Segoe UI"/>
-          <w:b w:val="0"/>
+          <w:b/>
           <w:i w:val="0"/>
           <w:color w:val="1E293B"/>
-          <w:sz w:val="20"/>
-        </w:rPr>
-        <w:t>[Hệ Thống Trigger Tự Động &amp; Menu Tiện Ích](#6-hệ-thống-trigger-tự-động--menu-tiện-ích)</w:t>
+          <w:sz w:val="22"/>
+        </w:rPr>
+        <w:t>Hệ Thống Trigger Tự Động &amp; Menu Tiện Ích</w:t>
       </w:r>
     </w:p>
     <w:p>

</xml_diff>